<commit_message>
Update  Phase 4 document formatting
</commit_message>
<xml_diff>
--- a/Phase 4 - Project Planning/Phase 4 - Project Planning.docx
+++ b/Phase 4 - Project Planning/Phase 4 - Project Planning.docx
@@ -6,14 +6,20 @@
       <w:pPr>
         <w:jc w:val="center"/>
         <w:rPr>
+          <w:rFonts w:ascii="Times New Roman" w:hAnsi="Times New Roman" w:cs="Times New Roman"/>
           <w:b/>
           <w:bCs/>
-        </w:rPr>
-      </w:pPr>
-      <w:r>
-        <w:rPr>
+          <w:sz w:val="32"/>
+          <w:szCs w:val="32"/>
+        </w:rPr>
+      </w:pPr>
+      <w:r>
+        <w:rPr>
+          <w:rFonts w:ascii="Times New Roman" w:hAnsi="Times New Roman" w:cs="Times New Roman"/>
           <w:b/>
           <w:bCs/>
+          <w:sz w:val="32"/>
+          <w:szCs w:val="32"/>
         </w:rPr>
         <w:t>Phase 4 – Project Planning</w:t>
       </w:r>
@@ -21,11 +27,19 @@
     <w:p>
       <w:pPr>
         <w:jc w:val="center"/>
-      </w:pPr>
-      <w:r>
-        <w:rPr>
+        <w:rPr>
+          <w:rFonts w:ascii="Times New Roman" w:hAnsi="Times New Roman" w:cs="Times New Roman"/>
+          <w:sz w:val="32"/>
+          <w:szCs w:val="32"/>
+        </w:rPr>
+      </w:pPr>
+      <w:r>
+        <w:rPr>
+          <w:rFonts w:ascii="Times New Roman" w:hAnsi="Times New Roman" w:cs="Times New Roman"/>
           <w:b/>
           <w:bCs/>
+          <w:sz w:val="32"/>
+          <w:szCs w:val="32"/>
         </w:rPr>
         <w:t>Script-Controlled ACL – Restrict Record Access Based on Field Value</w:t>
       </w:r>
@@ -33,20 +47,34 @@
     <w:p>
       <w:pPr>
         <w:rPr>
+          <w:rFonts w:ascii="Times New Roman" w:hAnsi="Times New Roman" w:cs="Times New Roman"/>
           <w:b/>
           <w:bCs/>
-        </w:rPr>
-      </w:pPr>
-      <w:r>
-        <w:rPr>
+          <w:sz w:val="28"/>
+          <w:szCs w:val="28"/>
+        </w:rPr>
+      </w:pPr>
+      <w:r>
+        <w:rPr>
+          <w:rFonts w:ascii="Times New Roman" w:hAnsi="Times New Roman" w:cs="Times New Roman"/>
           <w:b/>
           <w:bCs/>
+          <w:sz w:val="28"/>
+          <w:szCs w:val="28"/>
         </w:rPr>
         <w:t>1. Project Plan</w:t>
       </w:r>
     </w:p>
     <w:p>
-      <w:r>
+      <w:pPr>
+        <w:rPr>
+          <w:rFonts w:ascii="Times New Roman" w:hAnsi="Times New Roman" w:cs="Times New Roman"/>
+        </w:rPr>
+      </w:pPr>
+      <w:r>
+        <w:rPr>
+          <w:rFonts w:ascii="Times New Roman" w:hAnsi="Times New Roman" w:cs="Times New Roman"/>
+        </w:rPr>
         <w:t>The project is planned in the following sequence:</w:t>
       </w:r>
     </w:p>
@@ -56,8 +84,14 @@
           <w:ilvl w:val="0"/>
           <w:numId w:val="1"/>
         </w:numPr>
-      </w:pPr>
-      <w:r>
+        <w:rPr>
+          <w:rFonts w:ascii="Times New Roman" w:hAnsi="Times New Roman" w:cs="Times New Roman"/>
+        </w:rPr>
+      </w:pPr>
+      <w:r>
+        <w:rPr>
+          <w:rFonts w:ascii="Times New Roman" w:hAnsi="Times New Roman" w:cs="Times New Roman"/>
+        </w:rPr>
         <w:t>Log in to the ServiceNow instance with admin access.</w:t>
       </w:r>
     </w:p>
@@ -67,8 +101,14 @@
           <w:ilvl w:val="0"/>
           <w:numId w:val="1"/>
         </w:numPr>
-      </w:pPr>
-      <w:r>
+        <w:rPr>
+          <w:rFonts w:ascii="Times New Roman" w:hAnsi="Times New Roman" w:cs="Times New Roman"/>
+        </w:rPr>
+      </w:pPr>
+      <w:r>
+        <w:rPr>
+          <w:rFonts w:ascii="Times New Roman" w:hAnsi="Times New Roman" w:cs="Times New Roman"/>
+        </w:rPr>
         <w:t>Create the EEE User.</w:t>
       </w:r>
     </w:p>
@@ -78,8 +118,14 @@
           <w:ilvl w:val="0"/>
           <w:numId w:val="1"/>
         </w:numPr>
-      </w:pPr>
-      <w:r>
+        <w:rPr>
+          <w:rFonts w:ascii="Times New Roman" w:hAnsi="Times New Roman" w:cs="Times New Roman"/>
+        </w:rPr>
+      </w:pPr>
+      <w:r>
+        <w:rPr>
+          <w:rFonts w:ascii="Times New Roman" w:hAnsi="Times New Roman" w:cs="Times New Roman"/>
+        </w:rPr>
         <w:t>Create roles bb1, bb2, bb3 and bb4.</w:t>
       </w:r>
     </w:p>
@@ -89,8 +135,14 @@
           <w:ilvl w:val="0"/>
           <w:numId w:val="1"/>
         </w:numPr>
-      </w:pPr>
-      <w:r>
+        <w:rPr>
+          <w:rFonts w:ascii="Times New Roman" w:hAnsi="Times New Roman" w:cs="Times New Roman"/>
+        </w:rPr>
+      </w:pPr>
+      <w:r>
+        <w:rPr>
+          <w:rFonts w:ascii="Times New Roman" w:hAnsi="Times New Roman" w:cs="Times New Roman"/>
+        </w:rPr>
         <w:t>Assign all roles to the EEE User.</w:t>
       </w:r>
     </w:p>
@@ -100,8 +152,14 @@
           <w:ilvl w:val="0"/>
           <w:numId w:val="1"/>
         </w:numPr>
-      </w:pPr>
-      <w:r>
+        <w:rPr>
+          <w:rFonts w:ascii="Times New Roman" w:hAnsi="Times New Roman" w:cs="Times New Roman"/>
+        </w:rPr>
+      </w:pPr>
+      <w:r>
+        <w:rPr>
+          <w:rFonts w:ascii="Times New Roman" w:hAnsi="Times New Roman" w:cs="Times New Roman"/>
+        </w:rPr>
         <w:t>Create the Institution Details table.</w:t>
       </w:r>
     </w:p>
@@ -111,8 +169,14 @@
           <w:ilvl w:val="0"/>
           <w:numId w:val="1"/>
         </w:numPr>
-      </w:pPr>
-      <w:r>
+        <w:rPr>
+          <w:rFonts w:ascii="Times New Roman" w:hAnsi="Times New Roman" w:cs="Times New Roman"/>
+        </w:rPr>
+      </w:pPr>
+      <w:r>
+        <w:rPr>
+          <w:rFonts w:ascii="Times New Roman" w:hAnsi="Times New Roman" w:cs="Times New Roman"/>
+        </w:rPr>
         <w:t>Add the required fields.</w:t>
       </w:r>
     </w:p>
@@ -122,8 +186,14 @@
           <w:ilvl w:val="0"/>
           <w:numId w:val="1"/>
         </w:numPr>
-      </w:pPr>
-      <w:r>
+        <w:rPr>
+          <w:rFonts w:ascii="Times New Roman" w:hAnsi="Times New Roman" w:cs="Times New Roman"/>
+        </w:rPr>
+      </w:pPr>
+      <w:r>
+        <w:rPr>
+          <w:rFonts w:ascii="Times New Roman" w:hAnsi="Times New Roman" w:cs="Times New Roman"/>
+        </w:rPr>
         <w:t>Create records with ECE, EEE and CSE branch values.</w:t>
       </w:r>
     </w:p>
@@ -133,8 +203,14 @@
           <w:ilvl w:val="0"/>
           <w:numId w:val="1"/>
         </w:numPr>
-      </w:pPr>
-      <w:r>
+        <w:rPr>
+          <w:rFonts w:ascii="Times New Roman" w:hAnsi="Times New Roman" w:cs="Times New Roman"/>
+        </w:rPr>
+      </w:pPr>
+      <w:r>
+        <w:rPr>
+          <w:rFonts w:ascii="Times New Roman" w:hAnsi="Times New Roman" w:cs="Times New Roman"/>
+        </w:rPr>
         <w:t>Create the READ ACL.</w:t>
       </w:r>
     </w:p>
@@ -144,8 +220,14 @@
           <w:ilvl w:val="0"/>
           <w:numId w:val="1"/>
         </w:numPr>
-      </w:pPr>
-      <w:r>
+        <w:rPr>
+          <w:rFonts w:ascii="Times New Roman" w:hAnsi="Times New Roman" w:cs="Times New Roman"/>
+        </w:rPr>
+      </w:pPr>
+      <w:r>
+        <w:rPr>
+          <w:rFonts w:ascii="Times New Roman" w:hAnsi="Times New Roman" w:cs="Times New Roman"/>
+        </w:rPr>
         <w:t>Test READ access.</w:t>
       </w:r>
     </w:p>
@@ -155,8 +237,14 @@
           <w:ilvl w:val="0"/>
           <w:numId w:val="1"/>
         </w:numPr>
-      </w:pPr>
-      <w:r>
+        <w:rPr>
+          <w:rFonts w:ascii="Times New Roman" w:hAnsi="Times New Roman" w:cs="Times New Roman"/>
+        </w:rPr>
+      </w:pPr>
+      <w:r>
+        <w:rPr>
+          <w:rFonts w:ascii="Times New Roman" w:hAnsi="Times New Roman" w:cs="Times New Roman"/>
+        </w:rPr>
         <w:t>Create the CREATE ACL.</w:t>
       </w:r>
     </w:p>
@@ -166,8 +254,14 @@
           <w:ilvl w:val="0"/>
           <w:numId w:val="1"/>
         </w:numPr>
-      </w:pPr>
-      <w:r>
+        <w:rPr>
+          <w:rFonts w:ascii="Times New Roman" w:hAnsi="Times New Roman" w:cs="Times New Roman"/>
+        </w:rPr>
+      </w:pPr>
+      <w:r>
+        <w:rPr>
+          <w:rFonts w:ascii="Times New Roman" w:hAnsi="Times New Roman" w:cs="Times New Roman"/>
+        </w:rPr>
         <w:t>Test CREATE access.</w:t>
       </w:r>
     </w:p>
@@ -177,8 +271,14 @@
           <w:ilvl w:val="0"/>
           <w:numId w:val="1"/>
         </w:numPr>
-      </w:pPr>
-      <w:r>
+        <w:rPr>
+          <w:rFonts w:ascii="Times New Roman" w:hAnsi="Times New Roman" w:cs="Times New Roman"/>
+        </w:rPr>
+      </w:pPr>
+      <w:r>
+        <w:rPr>
+          <w:rFonts w:ascii="Times New Roman" w:hAnsi="Times New Roman" w:cs="Times New Roman"/>
+        </w:rPr>
         <w:t>Create the WRITE ACL.</w:t>
       </w:r>
     </w:p>
@@ -188,8 +288,14 @@
           <w:ilvl w:val="0"/>
           <w:numId w:val="1"/>
         </w:numPr>
-      </w:pPr>
-      <w:r>
+        <w:rPr>
+          <w:rFonts w:ascii="Times New Roman" w:hAnsi="Times New Roman" w:cs="Times New Roman"/>
+        </w:rPr>
+      </w:pPr>
+      <w:r>
+        <w:rPr>
+          <w:rFonts w:ascii="Times New Roman" w:hAnsi="Times New Roman" w:cs="Times New Roman"/>
+        </w:rPr>
         <w:t>Test WRITE access.</w:t>
       </w:r>
     </w:p>
@@ -199,8 +305,14 @@
           <w:ilvl w:val="0"/>
           <w:numId w:val="1"/>
         </w:numPr>
-      </w:pPr>
-      <w:r>
+        <w:rPr>
+          <w:rFonts w:ascii="Times New Roman" w:hAnsi="Times New Roman" w:cs="Times New Roman"/>
+        </w:rPr>
+      </w:pPr>
+      <w:r>
+        <w:rPr>
+          <w:rFonts w:ascii="Times New Roman" w:hAnsi="Times New Roman" w:cs="Times New Roman"/>
+        </w:rPr>
         <w:t>Create the DELETE ACL.</w:t>
       </w:r>
     </w:p>
@@ -210,8 +322,14 @@
           <w:ilvl w:val="0"/>
           <w:numId w:val="1"/>
         </w:numPr>
-      </w:pPr>
-      <w:r>
+        <w:rPr>
+          <w:rFonts w:ascii="Times New Roman" w:hAnsi="Times New Roman" w:cs="Times New Roman"/>
+        </w:rPr>
+      </w:pPr>
+      <w:r>
+        <w:rPr>
+          <w:rFonts w:ascii="Times New Roman" w:hAnsi="Times New Roman" w:cs="Times New Roman"/>
+        </w:rPr>
         <w:t>Test DELETE access.</w:t>
       </w:r>
     </w:p>
@@ -221,28 +339,48 @@
           <w:ilvl w:val="0"/>
           <w:numId w:val="1"/>
         </w:numPr>
-      </w:pPr>
-      <w:r>
+        <w:rPr>
+          <w:rFonts w:ascii="Times New Roman" w:hAnsi="Times New Roman" w:cs="Times New Roman"/>
+        </w:rPr>
+      </w:pPr>
+      <w:r>
+        <w:rPr>
+          <w:rFonts w:ascii="Times New Roman" w:hAnsi="Times New Roman" w:cs="Times New Roman"/>
+        </w:rPr>
         <w:t>Verify the final access behaviour.</w:t>
       </w:r>
     </w:p>
     <w:p>
       <w:pPr>
         <w:rPr>
+          <w:rFonts w:ascii="Times New Roman" w:hAnsi="Times New Roman" w:cs="Times New Roman"/>
           <w:b/>
           <w:bCs/>
-        </w:rPr>
-      </w:pPr>
-      <w:r>
-        <w:rPr>
+          <w:sz w:val="28"/>
+          <w:szCs w:val="28"/>
+        </w:rPr>
+      </w:pPr>
+      <w:r>
+        <w:rPr>
+          <w:rFonts w:ascii="Times New Roman" w:hAnsi="Times New Roman" w:cs="Times New Roman"/>
           <w:b/>
           <w:bCs/>
+          <w:sz w:val="28"/>
+          <w:szCs w:val="28"/>
         </w:rPr>
         <w:t>2. READ Testing Plan</w:t>
       </w:r>
     </w:p>
     <w:p>
-      <w:r>
+      <w:pPr>
+        <w:rPr>
+          <w:rFonts w:ascii="Times New Roman" w:hAnsi="Times New Roman" w:cs="Times New Roman"/>
+        </w:rPr>
+      </w:pPr>
+      <w:r>
+        <w:rPr>
+          <w:rFonts w:ascii="Times New Roman" w:hAnsi="Times New Roman" w:cs="Times New Roman"/>
+        </w:rPr>
         <w:t>The following cases will be verified:</w:t>
       </w:r>
     </w:p>
@@ -252,8 +390,14 @@
           <w:ilvl w:val="0"/>
           <w:numId w:val="2"/>
         </w:numPr>
-      </w:pPr>
-      <w:r>
+        <w:rPr>
+          <w:rFonts w:ascii="Times New Roman" w:hAnsi="Times New Roman" w:cs="Times New Roman"/>
+        </w:rPr>
+      </w:pPr>
+      <w:r>
+        <w:rPr>
+          <w:rFonts w:ascii="Times New Roman" w:hAnsi="Times New Roman" w:cs="Times New Roman"/>
+        </w:rPr>
         <w:t>User with bb1 can view EEE branch records.</w:t>
       </w:r>
     </w:p>
@@ -263,8 +407,14 @@
           <w:ilvl w:val="0"/>
           <w:numId w:val="2"/>
         </w:numPr>
-      </w:pPr>
-      <w:r>
+        <w:rPr>
+          <w:rFonts w:ascii="Times New Roman" w:hAnsi="Times New Roman" w:cs="Times New Roman"/>
+        </w:rPr>
+      </w:pPr>
+      <w:r>
+        <w:rPr>
+          <w:rFonts w:ascii="Times New Roman" w:hAnsi="Times New Roman" w:cs="Times New Roman"/>
+        </w:rPr>
         <w:t>User without the required role cannot view records.</w:t>
       </w:r>
     </w:p>
@@ -274,93 +424,161 @@
           <w:ilvl w:val="0"/>
           <w:numId w:val="2"/>
         </w:numPr>
-      </w:pPr>
-      <w:r>
+        <w:rPr>
+          <w:rFonts w:ascii="Times New Roman" w:hAnsi="Times New Roman" w:cs="Times New Roman"/>
+        </w:rPr>
+      </w:pPr>
+      <w:r>
+        <w:rPr>
+          <w:rFonts w:ascii="Times New Roman" w:hAnsi="Times New Roman" w:cs="Times New Roman"/>
+        </w:rPr>
         <w:t>Administrator can view all records.</w:t>
       </w:r>
     </w:p>
     <w:p>
       <w:pPr>
         <w:rPr>
+          <w:rFonts w:ascii="Times New Roman" w:hAnsi="Times New Roman" w:cs="Times New Roman"/>
           <w:b/>
           <w:bCs/>
-        </w:rPr>
-      </w:pPr>
-      <w:r>
-        <w:rPr>
+          <w:sz w:val="28"/>
+          <w:szCs w:val="28"/>
+        </w:rPr>
+      </w:pPr>
+      <w:r>
+        <w:rPr>
+          <w:rFonts w:ascii="Times New Roman" w:hAnsi="Times New Roman" w:cs="Times New Roman"/>
           <w:b/>
           <w:bCs/>
+          <w:sz w:val="28"/>
+          <w:szCs w:val="28"/>
         </w:rPr>
         <w:t>3. CREATE Testing Plan</w:t>
       </w:r>
     </w:p>
     <w:p>
-      <w:r>
+      <w:pPr>
+        <w:rPr>
+          <w:rFonts w:ascii="Times New Roman" w:hAnsi="Times New Roman" w:cs="Times New Roman"/>
+        </w:rPr>
+      </w:pPr>
+      <w:r>
+        <w:rPr>
+          <w:rFonts w:ascii="Times New Roman" w:hAnsi="Times New Roman" w:cs="Times New Roman"/>
+        </w:rPr>
         <w:t>A user with bb1 and bb2 should be able to view EEE records and access the New button.</w:t>
       </w:r>
     </w:p>
     <w:p>
       <w:pPr>
         <w:rPr>
+          <w:rFonts w:ascii="Times New Roman" w:hAnsi="Times New Roman" w:cs="Times New Roman"/>
           <w:b/>
           <w:bCs/>
-        </w:rPr>
-      </w:pPr>
-      <w:r>
-        <w:rPr>
+          <w:sz w:val="28"/>
+          <w:szCs w:val="28"/>
+        </w:rPr>
+      </w:pPr>
+      <w:r>
+        <w:rPr>
+          <w:rFonts w:ascii="Times New Roman" w:hAnsi="Times New Roman" w:cs="Times New Roman"/>
           <w:b/>
           <w:bCs/>
+          <w:sz w:val="28"/>
+          <w:szCs w:val="28"/>
         </w:rPr>
         <w:lastRenderedPageBreak/>
         <w:t>4. WRITE Testing Plan</w:t>
       </w:r>
     </w:p>
     <w:p>
-      <w:r>
+      <w:pPr>
+        <w:rPr>
+          <w:rFonts w:ascii="Times New Roman" w:hAnsi="Times New Roman" w:cs="Times New Roman"/>
+        </w:rPr>
+      </w:pPr>
+      <w:r>
+        <w:rPr>
+          <w:rFonts w:ascii="Times New Roman" w:hAnsi="Times New Roman" w:cs="Times New Roman"/>
+        </w:rPr>
         <w:t>A user with bb1, bb2 and bb3 should be able to view and edit EEE records.</w:t>
       </w:r>
     </w:p>
     <w:p>
       <w:pPr>
         <w:rPr>
+          <w:rFonts w:ascii="Times New Roman" w:hAnsi="Times New Roman" w:cs="Times New Roman"/>
           <w:b/>
           <w:bCs/>
-        </w:rPr>
-      </w:pPr>
-      <w:r>
-        <w:rPr>
+          <w:sz w:val="28"/>
+          <w:szCs w:val="28"/>
+        </w:rPr>
+      </w:pPr>
+      <w:r>
+        <w:rPr>
+          <w:rFonts w:ascii="Times New Roman" w:hAnsi="Times New Roman" w:cs="Times New Roman"/>
           <w:b/>
           <w:bCs/>
+          <w:sz w:val="28"/>
+          <w:szCs w:val="28"/>
         </w:rPr>
         <w:t>5. DELETE Testing Plan</w:t>
       </w:r>
     </w:p>
     <w:p>
-      <w:r>
+      <w:pPr>
+        <w:rPr>
+          <w:rFonts w:ascii="Times New Roman" w:hAnsi="Times New Roman" w:cs="Times New Roman"/>
+        </w:rPr>
+      </w:pPr>
+      <w:r>
+        <w:rPr>
+          <w:rFonts w:ascii="Times New Roman" w:hAnsi="Times New Roman" w:cs="Times New Roman"/>
+        </w:rPr>
         <w:t>A user with bb1, bb2, bb3 and bb4 should be able to view, create, edit and delete EEE records.</w:t>
       </w:r>
     </w:p>
     <w:p>
       <w:pPr>
         <w:rPr>
+          <w:rFonts w:ascii="Times New Roman" w:hAnsi="Times New Roman" w:cs="Times New Roman"/>
           <w:b/>
           <w:bCs/>
-        </w:rPr>
-      </w:pPr>
-      <w:r>
-        <w:rPr>
+          <w:sz w:val="28"/>
+          <w:szCs w:val="28"/>
+        </w:rPr>
+      </w:pPr>
+      <w:r>
+        <w:rPr>
+          <w:rFonts w:ascii="Times New Roman" w:hAnsi="Times New Roman" w:cs="Times New Roman"/>
           <w:b/>
           <w:bCs/>
+          <w:sz w:val="28"/>
+          <w:szCs w:val="28"/>
         </w:rPr>
         <w:t>6. Completion Criteria</w:t>
       </w:r>
     </w:p>
     <w:p>
-      <w:r>
+      <w:pPr>
+        <w:rPr>
+          <w:rFonts w:ascii="Times New Roman" w:hAnsi="Times New Roman" w:cs="Times New Roman"/>
+        </w:rPr>
+      </w:pPr>
+      <w:r>
+        <w:rPr>
+          <w:rFonts w:ascii="Times New Roman" w:hAnsi="Times New Roman" w:cs="Times New Roman"/>
+        </w:rPr>
         <w:t>The project will be considered completed after all four ACL operations are configured and their access behaviour is verified.</w:t>
       </w:r>
     </w:p>
-    <w:p/>
+    <w:p>
+      <w:pPr>
+        <w:rPr>
+          <w:rFonts w:ascii="Times New Roman" w:hAnsi="Times New Roman" w:cs="Times New Roman"/>
+        </w:rPr>
+      </w:pPr>
+    </w:p>
     <w:sectPr>
       <w:pgSz w:w="11906" w:h="16838"/>
       <w:pgMar w:top="1440" w:right="1440" w:bottom="1440" w:left="1440" w:header="708" w:footer="708" w:gutter="0"/>
@@ -1247,6 +1465,7 @@
   <w:style w:type="character" w:default="1" w:styleId="DefaultParagraphFont">
     <w:name w:val="Default Paragraph Font"/>
     <w:uiPriority w:val="1"/>
+    <w:semiHidden/>
     <w:unhideWhenUsed/>
   </w:style>
   <w:style w:type="table" w:default="1" w:styleId="TableNormal">

</xml_diff>